<commit_message>
feat: add EmptyStateComponent for displaying no content state
feat: enhance HeroComponent with dynamic inputs for title, description, and metrics

fix: update ImageStripComponent to include image frame styling

refactor: improve QuickCommentComponent layout and error handling

style: update StatCardComponent styling for consistency

chore: remove WipBannerComponent as it's no longer needed

style: refactor global styles for improved theming and layout

fix: adjust responsive design for better mobile experience
</commit_message>
<xml_diff>
--- a/Plantilla Documento Visión.docx
+++ b/Plantilla Documento Visión.docx
@@ -1,6 +1,6 @@
 
 <file path=word/document.xml><?xml version="1.0" encoding="utf-8"?>
-<w:document xmlns:wpc="http://schemas.microsoft.com/office/word/2010/wordprocessingCanvas" xmlns:cx="http://schemas.microsoft.com/office/drawing/2014/chartex" xmlns:mc="http://schemas.openxmlformats.org/markup-compatibility/2006" xmlns:o="urn:schemas-microsoft-com:office:office" xmlns:r="http://schemas.openxmlformats.org/officeDocument/2006/relationships" xmlns:m="http://schemas.openxmlformats.org/officeDocument/2006/math" xmlns:v="urn:schemas-microsoft-com:vml" xmlns:wp14="http://schemas.microsoft.com/office/word/2010/wordprocessingDrawing" xmlns:wp="http://schemas.openxmlformats.org/drawingml/2006/wordprocessingDrawing" xmlns:w10="urn:schemas-microsoft-com:office:word" xmlns:w="http://schemas.openxmlformats.org/wordprocessingml/2006/main" xmlns:w14="http://schemas.microsoft.com/office/word/2010/wordml" xmlns:w15="http://schemas.microsoft.com/office/word/2012/wordml" xmlns:w16se="http://schemas.microsoft.com/office/word/2015/wordml/symex" xmlns:wpg="http://schemas.microsoft.com/office/word/2010/wordprocessingGroup" xmlns:wpi="http://schemas.microsoft.com/office/word/2010/wordprocessingInk" xmlns:wne="http://schemas.microsoft.com/office/word/2006/wordml" xmlns:wps="http://schemas.microsoft.com/office/word/2010/wordprocessingShape" mc:Ignorable="w14 w15 w16se wp14">
+<w:document xmlns:wpc="http://schemas.microsoft.com/office/word/2010/wordprocessingCanvas" xmlns:cx="http://schemas.microsoft.com/office/drawing/2014/chartex" xmlns:cx1="http://schemas.microsoft.com/office/drawing/2015/9/8/chartex" xmlns:cx2="http://schemas.microsoft.com/office/drawing/2015/10/21/chartex" xmlns:cx3="http://schemas.microsoft.com/office/drawing/2016/5/9/chartex" xmlns:cx4="http://schemas.microsoft.com/office/drawing/2016/5/10/chartex" xmlns:cx5="http://schemas.microsoft.com/office/drawing/2016/5/11/chartex" xmlns:cx6="http://schemas.microsoft.com/office/drawing/2016/5/12/chartex" xmlns:cx7="http://schemas.microsoft.com/office/drawing/2016/5/13/chartex" xmlns:cx8="http://schemas.microsoft.com/office/drawing/2016/5/14/chartex" xmlns:mc="http://schemas.openxmlformats.org/markup-compatibility/2006" xmlns:aink="http://schemas.microsoft.com/office/drawing/2016/ink" xmlns:am3d="http://schemas.microsoft.com/office/drawing/2017/model3d" xmlns:o="urn:schemas-microsoft-com:office:office" xmlns:oel="http://schemas.microsoft.com/office/2019/extlst" xmlns:r="http://schemas.openxmlformats.org/officeDocument/2006/relationships" xmlns:m="http://schemas.openxmlformats.org/officeDocument/2006/math" xmlns:v="urn:schemas-microsoft-com:vml" xmlns:wp14="http://schemas.microsoft.com/office/word/2010/wordprocessingDrawing" xmlns:wp="http://schemas.openxmlformats.org/drawingml/2006/wordprocessingDrawing" xmlns:w10="urn:schemas-microsoft-com:office:word" xmlns:w="http://schemas.openxmlformats.org/wordprocessingml/2006/main" xmlns:w14="http://schemas.microsoft.com/office/word/2010/wordml" xmlns:w15="http://schemas.microsoft.com/office/word/2012/wordml" xmlns:w16cex="http://schemas.microsoft.com/office/word/2018/wordml/cex" xmlns:w16cid="http://schemas.microsoft.com/office/word/2016/wordml/cid" xmlns:w16="http://schemas.microsoft.com/office/word/2018/wordml" xmlns:w16du="http://schemas.microsoft.com/office/word/2023/wordml/word16du" xmlns:w16sdtdh="http://schemas.microsoft.com/office/word/2020/wordml/sdtdatahash" xmlns:w16sdtfl="http://schemas.microsoft.com/office/word/2024/wordml/sdtformatlock" xmlns:w16se="http://schemas.microsoft.com/office/word/2015/wordml/symex" xmlns:wpg="http://schemas.microsoft.com/office/word/2010/wordprocessingGroup" xmlns:wpi="http://schemas.microsoft.com/office/word/2010/wordprocessingInk" xmlns:wne="http://schemas.microsoft.com/office/word/2006/wordml" xmlns:wps="http://schemas.microsoft.com/office/word/2010/wordprocessingShape" mc:Ignorable="w14 w15 w16se w16cid w16 w16cex w16sdtdh w16sdtfl w16du wp14">
   <w:body>
     <w:p>
       <w:pPr>
@@ -28,7 +28,7 @@
           <w:lang w:val="en-US"/>
         </w:rPr>
         <w:drawing>
-          <wp:inline distT="0" distB="0" distL="0" distR="0">
+          <wp:inline distT="0" distB="0" distL="0" distR="0" wp14:anchorId="41B94CBB" wp14:editId="41B94CBC">
             <wp:extent cx="563173" cy="587396"/>
             <wp:effectExtent l="0" t="0" r="8890" b="3175"/>
             <wp:docPr id="2" name="0 Imagen"/>
@@ -905,7 +905,7 @@
     </w:p>
     <w:tbl>
       <w:tblPr>
-        <w:tblStyle w:val="Tablaconcuadrcula"/>
+        <w:tblStyle w:val="TableGrid"/>
         <w:tblW w:w="9360" w:type="dxa"/>
         <w:tblLayout w:type="fixed"/>
         <w:tblLook w:val="06A0" w:firstRow="1" w:lastRow="0" w:firstColumn="1" w:lastColumn="0" w:noHBand="1" w:noVBand="1"/>
@@ -2901,8 +2901,6 @@
         </w:rPr>
         <w:t>Características del Sistema</w:t>
       </w:r>
-      <w:bookmarkStart w:id="0" w:name="_GoBack"/>
-      <w:bookmarkEnd w:id="0"/>
     </w:p>
     <w:p>
       <w:pPr>
@@ -4535,7 +4533,27 @@
           <w:szCs w:val="20"/>
           <w:lang w:eastAsia="es-DO"/>
         </w:rPr>
-        <w:t>objetivo principal con una breve descripción del problema&gt;,  brindándole los beneficios de &lt;breve descripción de los beneficios&gt;.</w:t>
+        <w:t>objetivo principal con una breve descripción del problema</w:t>
+      </w:r>
+      <w:proofErr w:type="gramStart"/>
+      <w:r>
+        <w:rPr>
+          <w:rFonts w:ascii="Times New Roman" w:eastAsia="Times New Roman" w:hAnsi="Times New Roman" w:cs="Times New Roman"/>
+          <w:sz w:val="20"/>
+          <w:szCs w:val="20"/>
+          <w:lang w:eastAsia="es-DO"/>
+        </w:rPr>
+        <w:t>&gt;,  brindándole</w:t>
+      </w:r>
+      <w:proofErr w:type="gramEnd"/>
+      <w:r>
+        <w:rPr>
+          <w:rFonts w:ascii="Times New Roman" w:eastAsia="Times New Roman" w:hAnsi="Times New Roman" w:cs="Times New Roman"/>
+          <w:sz w:val="20"/>
+          <w:szCs w:val="20"/>
+          <w:lang w:eastAsia="es-DO"/>
+        </w:rPr>
+        <w:t xml:space="preserve"> los beneficios de &lt;breve descripción de los beneficios&gt;.</w:t>
       </w:r>
     </w:p>
     <w:p>
@@ -5396,29 +5414,7 @@
                 <w:szCs w:val="20"/>
                 <w:lang w:val="en-US" w:eastAsia="es-DO"/>
               </w:rPr>
-              <w:t>:  </w:t>
-            </w:r>
-            <w:proofErr w:type="spellStart"/>
-            <w:r>
-              <w:rPr>
-                <w:rFonts w:ascii="Times New Roman" w:eastAsia="Times New Roman" w:hAnsi="Times New Roman" w:cs="Times New Roman"/>
-                <w:color w:val="548DD4"/>
-                <w:sz w:val="20"/>
-                <w:szCs w:val="20"/>
-                <w:lang w:val="en-US" w:eastAsia="es-DO"/>
-              </w:rPr>
-              <w:t>Nombre</w:t>
-            </w:r>
-            <w:proofErr w:type="spellEnd"/>
-            <w:r>
-              <w:rPr>
-                <w:rFonts w:ascii="Times New Roman" w:eastAsia="Times New Roman" w:hAnsi="Times New Roman" w:cs="Times New Roman"/>
-                <w:color w:val="548DD4"/>
-                <w:sz w:val="20"/>
-                <w:szCs w:val="20"/>
-                <w:lang w:val="en-US" w:eastAsia="es-DO"/>
-              </w:rPr>
-              <w:t xml:space="preserve"> </w:t>
+              <w:t xml:space="preserve">:  Nombre </w:t>
             </w:r>
             <w:proofErr w:type="spellStart"/>
             <w:r>
@@ -10801,29 +10797,7 @@
           <w:szCs w:val="20"/>
           <w:lang w:eastAsia="es-DO"/>
         </w:rPr>
-        <w:t xml:space="preserve"> será provista, indicar el tipo y las características.  La ayuda en línea incluye: botones de ayuda en la barra de herramientas del software que explique funcionamiento, formato  y objetivos de pantallas, páginas o campos de estas, en el sistema.  Incluye también, servicios de apoyo por medio de </w:t>
-      </w:r>
-      <w:proofErr w:type="spellStart"/>
-      <w:r>
-        <w:rPr>
-          <w:rFonts w:ascii="Times New Roman" w:eastAsia="Times New Roman" w:hAnsi="Times New Roman" w:cs="Times New Roman"/>
-          <w:color w:val="548DD4"/>
-          <w:sz w:val="20"/>
-          <w:szCs w:val="20"/>
-          <w:lang w:eastAsia="es-DO"/>
-        </w:rPr>
-        <w:t>Help</w:t>
-      </w:r>
-      <w:proofErr w:type="spellEnd"/>
-      <w:r>
-        <w:rPr>
-          <w:rFonts w:ascii="Times New Roman" w:eastAsia="Times New Roman" w:hAnsi="Times New Roman" w:cs="Times New Roman"/>
-          <w:color w:val="548DD4"/>
-          <w:sz w:val="20"/>
-          <w:szCs w:val="20"/>
-          <w:lang w:eastAsia="es-DO"/>
-        </w:rPr>
-        <w:t xml:space="preserve"> </w:t>
+        <w:t xml:space="preserve"> será provista, indicar el tipo y las características.  La ayuda en línea incluye: botones de ayuda en la barra de herramientas del software que explique funcionamiento, formato  y objetivos de pantallas, páginas o campos de estas, en el sistema.  Incluye también, servicios de apoyo por medio de Help </w:t>
       </w:r>
       <w:proofErr w:type="spellStart"/>
       <w:r>
@@ -11020,7 +10994,7 @@
 </file>
 
 <file path=word/numbering.xml><?xml version="1.0" encoding="utf-8"?>
-<w:numbering xmlns:wpc="http://schemas.microsoft.com/office/word/2010/wordprocessingCanvas" xmlns:cx="http://schemas.microsoft.com/office/drawing/2014/chartex" xmlns:mc="http://schemas.openxmlformats.org/markup-compatibility/2006" xmlns:o="urn:schemas-microsoft-com:office:office" xmlns:r="http://schemas.openxmlformats.org/officeDocument/2006/relationships" xmlns:m="http://schemas.openxmlformats.org/officeDocument/2006/math" xmlns:v="urn:schemas-microsoft-com:vml" xmlns:wp14="http://schemas.microsoft.com/office/word/2010/wordprocessingDrawing" xmlns:wp="http://schemas.openxmlformats.org/drawingml/2006/wordprocessingDrawing" xmlns:w10="urn:schemas-microsoft-com:office:word" xmlns:w="http://schemas.openxmlformats.org/wordprocessingml/2006/main" xmlns:w14="http://schemas.microsoft.com/office/word/2010/wordml" xmlns:w15="http://schemas.microsoft.com/office/word/2012/wordml" xmlns:w16se="http://schemas.microsoft.com/office/word/2015/wordml/symex" xmlns:wpg="http://schemas.microsoft.com/office/word/2010/wordprocessingGroup" xmlns:wpi="http://schemas.microsoft.com/office/word/2010/wordprocessingInk" xmlns:wne="http://schemas.microsoft.com/office/word/2006/wordml" xmlns:wps="http://schemas.microsoft.com/office/word/2010/wordprocessingShape" mc:Ignorable="w14 w15 w16se wp14">
+<w:numbering xmlns:wpc="http://schemas.microsoft.com/office/word/2010/wordprocessingCanvas" xmlns:cx="http://schemas.microsoft.com/office/drawing/2014/chartex" xmlns:cx1="http://schemas.microsoft.com/office/drawing/2015/9/8/chartex" xmlns:cx2="http://schemas.microsoft.com/office/drawing/2015/10/21/chartex" xmlns:cx3="http://schemas.microsoft.com/office/drawing/2016/5/9/chartex" xmlns:cx4="http://schemas.microsoft.com/office/drawing/2016/5/10/chartex" xmlns:cx5="http://schemas.microsoft.com/office/drawing/2016/5/11/chartex" xmlns:cx6="http://schemas.microsoft.com/office/drawing/2016/5/12/chartex" xmlns:cx7="http://schemas.microsoft.com/office/drawing/2016/5/13/chartex" xmlns:cx8="http://schemas.microsoft.com/office/drawing/2016/5/14/chartex" xmlns:mc="http://schemas.openxmlformats.org/markup-compatibility/2006" xmlns:aink="http://schemas.microsoft.com/office/drawing/2016/ink" xmlns:am3d="http://schemas.microsoft.com/office/drawing/2017/model3d" xmlns:o="urn:schemas-microsoft-com:office:office" xmlns:oel="http://schemas.microsoft.com/office/2019/extlst" xmlns:r="http://schemas.openxmlformats.org/officeDocument/2006/relationships" xmlns:m="http://schemas.openxmlformats.org/officeDocument/2006/math" xmlns:v="urn:schemas-microsoft-com:vml" xmlns:wp14="http://schemas.microsoft.com/office/word/2010/wordprocessingDrawing" xmlns:wp="http://schemas.openxmlformats.org/drawingml/2006/wordprocessingDrawing" xmlns:w10="urn:schemas-microsoft-com:office:word" xmlns:w="http://schemas.openxmlformats.org/wordprocessingml/2006/main" xmlns:w14="http://schemas.microsoft.com/office/word/2010/wordml" xmlns:w15="http://schemas.microsoft.com/office/word/2012/wordml" xmlns:w16cex="http://schemas.microsoft.com/office/word/2018/wordml/cex" xmlns:w16cid="http://schemas.microsoft.com/office/word/2016/wordml/cid" xmlns:w16="http://schemas.microsoft.com/office/word/2018/wordml" xmlns:w16du="http://schemas.microsoft.com/office/word/2023/wordml/word16du" xmlns:w16sdtdh="http://schemas.microsoft.com/office/word/2020/wordml/sdtdatahash" xmlns:w16sdtfl="http://schemas.microsoft.com/office/word/2024/wordml/sdtformatlock" xmlns:w16se="http://schemas.microsoft.com/office/word/2015/wordml/symex" xmlns:wpg="http://schemas.microsoft.com/office/word/2010/wordprocessingGroup" xmlns:wpi="http://schemas.microsoft.com/office/word/2010/wordprocessingInk" xmlns:wne="http://schemas.microsoft.com/office/word/2006/wordml" xmlns:wps="http://schemas.microsoft.com/office/word/2010/wordprocessingShape" mc:Ignorable="w14 w15 w16se w16cid w16 w16cex w16sdtdh w16sdtfl w16du wp14">
   <w:abstractNum w:abstractNumId="0" w15:restartNumberingAfterBreak="0">
     <w:nsid w:val="12D64ADD"/>
     <w:multiLevelType w:val="multilevel"/>
@@ -12075,10 +12049,10 @@
       </w:rPr>
     </w:lvl>
   </w:abstractNum>
-  <w:num w:numId="1">
+  <w:num w:numId="1" w16cid:durableId="2030330291">
     <w:abstractNumId w:val="2"/>
   </w:num>
-  <w:num w:numId="2">
+  <w:num w:numId="2" w16cid:durableId="1123646160">
     <w:abstractNumId w:val="2"/>
     <w:lvlOverride w:ilvl="1">
       <w:lvl w:ilvl="1">
@@ -12088,7 +12062,7 @@
       </w:lvl>
     </w:lvlOverride>
   </w:num>
-  <w:num w:numId="3">
+  <w:num w:numId="3" w16cid:durableId="997029153">
     <w:abstractNumId w:val="2"/>
     <w:lvlOverride w:ilvl="1">
       <w:lvl w:ilvl="1">
@@ -12098,7 +12072,7 @@
       </w:lvl>
     </w:lvlOverride>
   </w:num>
-  <w:num w:numId="4">
+  <w:num w:numId="4" w16cid:durableId="1080909565">
     <w:abstractNumId w:val="2"/>
     <w:lvlOverride w:ilvl="1">
       <w:lvl w:ilvl="1">
@@ -12108,7 +12082,7 @@
       </w:lvl>
     </w:lvlOverride>
   </w:num>
-  <w:num w:numId="5">
+  <w:num w:numId="5" w16cid:durableId="787168266">
     <w:abstractNumId w:val="2"/>
     <w:lvlOverride w:ilvl="1">
       <w:lvl w:ilvl="1">
@@ -12118,7 +12092,7 @@
       </w:lvl>
     </w:lvlOverride>
   </w:num>
-  <w:num w:numId="6">
+  <w:num w:numId="6" w16cid:durableId="1873377708">
     <w:abstractNumId w:val="1"/>
     <w:lvlOverride w:ilvl="0">
       <w:lvl w:ilvl="0">
@@ -12128,7 +12102,7 @@
       </w:lvl>
     </w:lvlOverride>
   </w:num>
-  <w:num w:numId="7">
+  <w:num w:numId="7" w16cid:durableId="1220941232">
     <w:abstractNumId w:val="1"/>
     <w:lvlOverride w:ilvl="0">
       <w:lvl w:ilvl="0">
@@ -12145,7 +12119,7 @@
       </w:lvl>
     </w:lvlOverride>
   </w:num>
-  <w:num w:numId="8">
+  <w:num w:numId="8" w16cid:durableId="1003970519">
     <w:abstractNumId w:val="1"/>
     <w:lvlOverride w:ilvl="0">
       <w:lvl w:ilvl="0">
@@ -12162,7 +12136,7 @@
       </w:lvl>
     </w:lvlOverride>
   </w:num>
-  <w:num w:numId="9">
+  <w:num w:numId="9" w16cid:durableId="2013213010">
     <w:abstractNumId w:val="1"/>
     <w:lvlOverride w:ilvl="0">
       <w:lvl w:ilvl="0">
@@ -12179,7 +12153,7 @@
       </w:lvl>
     </w:lvlOverride>
   </w:num>
-  <w:num w:numId="10">
+  <w:num w:numId="10" w16cid:durableId="1529833542">
     <w:abstractNumId w:val="1"/>
     <w:lvlOverride w:ilvl="0">
       <w:lvl w:ilvl="0">
@@ -12196,7 +12170,7 @@
       </w:lvl>
     </w:lvlOverride>
   </w:num>
-  <w:num w:numId="11">
+  <w:num w:numId="11" w16cid:durableId="1188644330">
     <w:abstractNumId w:val="1"/>
     <w:lvlOverride w:ilvl="0">
       <w:lvl w:ilvl="0">
@@ -12298,7 +12272,7 @@
       </w:lvl>
     </w:lvlOverride>
   </w:num>
-  <w:num w:numId="12">
+  <w:num w:numId="12" w16cid:durableId="395057192">
     <w:abstractNumId w:val="1"/>
     <w:lvlOverride w:ilvl="0">
       <w:lvl w:ilvl="0">
@@ -12315,7 +12289,7 @@
       </w:lvl>
     </w:lvlOverride>
   </w:num>
-  <w:num w:numId="13">
+  <w:num w:numId="13" w16cid:durableId="1320694946">
     <w:abstractNumId w:val="1"/>
     <w:lvlOverride w:ilvl="0">
       <w:lvl w:ilvl="0">
@@ -12332,7 +12306,7 @@
       </w:lvl>
     </w:lvlOverride>
   </w:num>
-  <w:num w:numId="14">
+  <w:num w:numId="14" w16cid:durableId="2013951544">
     <w:abstractNumId w:val="1"/>
     <w:lvlOverride w:ilvl="0">
       <w:lvl w:ilvl="0">
@@ -12349,7 +12323,7 @@
       </w:lvl>
     </w:lvlOverride>
   </w:num>
-  <w:num w:numId="15">
+  <w:num w:numId="15" w16cid:durableId="710156073">
     <w:abstractNumId w:val="1"/>
     <w:lvlOverride w:ilvl="0">
       <w:lvl w:ilvl="0">
@@ -12366,7 +12340,7 @@
       </w:lvl>
     </w:lvlOverride>
   </w:num>
-  <w:num w:numId="16">
+  <w:num w:numId="16" w16cid:durableId="1421172728">
     <w:abstractNumId w:val="1"/>
     <w:lvlOverride w:ilvl="0">
       <w:lvl w:ilvl="0">
@@ -12383,29 +12357,29 @@
       </w:lvl>
     </w:lvlOverride>
   </w:num>
-  <w:num w:numId="17">
+  <w:num w:numId="17" w16cid:durableId="874586713">
     <w:abstractNumId w:val="3"/>
   </w:num>
-  <w:num w:numId="18">
+  <w:num w:numId="18" w16cid:durableId="1121068730">
     <w:abstractNumId w:val="0"/>
   </w:num>
-  <w:num w:numId="19">
+  <w:num w:numId="19" w16cid:durableId="957420362">
     <w:abstractNumId w:val="6"/>
   </w:num>
-  <w:num w:numId="20">
+  <w:num w:numId="20" w16cid:durableId="942685755">
     <w:abstractNumId w:val="4"/>
   </w:num>
-  <w:num w:numId="21">
+  <w:num w:numId="21" w16cid:durableId="1454013970">
     <w:abstractNumId w:val="7"/>
   </w:num>
-  <w:num w:numId="22">
+  <w:num w:numId="22" w16cid:durableId="596986561">
     <w:abstractNumId w:val="5"/>
   </w:num>
 </w:numbering>
 </file>
 
 <file path=word/styles.xml><?xml version="1.0" encoding="utf-8"?>
-<w:styles xmlns:mc="http://schemas.openxmlformats.org/markup-compatibility/2006" xmlns:r="http://schemas.openxmlformats.org/officeDocument/2006/relationships" xmlns:w="http://schemas.openxmlformats.org/wordprocessingml/2006/main" xmlns:w14="http://schemas.microsoft.com/office/word/2010/wordml" xmlns:w15="http://schemas.microsoft.com/office/word/2012/wordml" xmlns:w16se="http://schemas.microsoft.com/office/word/2015/wordml/symex" mc:Ignorable="w14 w15 w16se">
+<w:styles xmlns:mc="http://schemas.openxmlformats.org/markup-compatibility/2006" xmlns:r="http://schemas.openxmlformats.org/officeDocument/2006/relationships" xmlns:w="http://schemas.openxmlformats.org/wordprocessingml/2006/main" xmlns:w14="http://schemas.microsoft.com/office/word/2010/wordml" xmlns:w15="http://schemas.microsoft.com/office/word/2012/wordml" xmlns:w16cex="http://schemas.microsoft.com/office/word/2018/wordml/cex" xmlns:w16cid="http://schemas.microsoft.com/office/word/2016/wordml/cid" xmlns:w16="http://schemas.microsoft.com/office/word/2018/wordml" xmlns:w16du="http://schemas.microsoft.com/office/word/2023/wordml/word16du" xmlns:w16sdtdh="http://schemas.microsoft.com/office/word/2020/wordml/sdtdatahash" xmlns:w16sdtfl="http://schemas.microsoft.com/office/word/2024/wordml/sdtformatlock" xmlns:w16se="http://schemas.microsoft.com/office/word/2015/wordml/symex" mc:Ignorable="w14 w15 w16se w16cid w16 w16cex w16sdtdh w16sdtfl w16du">
   <w:docDefaults>
     <w:rPrDefault>
       <w:rPr>
@@ -12421,7 +12395,7 @@
       </w:pPr>
     </w:pPrDefault>
   </w:docDefaults>
-  <w:latentStyles w:defLockedState="0" w:defUIPriority="99" w:defSemiHidden="0" w:defUnhideWhenUsed="0" w:defQFormat="0" w:count="371">
+  <w:latentStyles w:defLockedState="0" w:defUIPriority="99" w:defSemiHidden="0" w:defUnhideWhenUsed="0" w:defQFormat="0" w:count="376">
     <w:lsdException w:name="Normal" w:uiPriority="0" w:qFormat="1"/>
     <w:lsdException w:name="heading 1" w:uiPriority="9" w:qFormat="1"/>
     <w:lsdException w:name="heading 2" w:semiHidden="1" w:uiPriority="9" w:unhideWhenUsed="1" w:qFormat="1"/>
@@ -12793,15 +12767,20 @@
     <w:lsdException w:name="List Table 5 Dark Accent 6" w:uiPriority="50"/>
     <w:lsdException w:name="List Table 6 Colorful Accent 6" w:uiPriority="51"/>
     <w:lsdException w:name="List Table 7 Colorful Accent 6" w:uiPriority="52"/>
+    <w:lsdException w:name="Mention" w:semiHidden="1" w:unhideWhenUsed="1"/>
+    <w:lsdException w:name="Smart Hyperlink" w:semiHidden="1" w:unhideWhenUsed="1"/>
+    <w:lsdException w:name="Hashtag" w:semiHidden="1" w:unhideWhenUsed="1"/>
+    <w:lsdException w:name="Unresolved Mention" w:semiHidden="1" w:unhideWhenUsed="1"/>
+    <w:lsdException w:name="Smart Link" w:semiHidden="1" w:unhideWhenUsed="1"/>
   </w:latentStyles>
   <w:style w:type="paragraph" w:default="1" w:styleId="Normal">
     <w:name w:val="Normal"/>
     <w:qFormat/>
   </w:style>
-  <w:style w:type="paragraph" w:styleId="Ttulo1">
+  <w:style w:type="paragraph" w:styleId="Heading1">
     <w:name w:val="heading 1"/>
     <w:basedOn w:val="Normal"/>
-    <w:link w:val="Ttulo1Car"/>
+    <w:link w:val="Heading1Char"/>
     <w:uiPriority w:val="9"/>
     <w:qFormat/>
     <w:rsid w:val="008F3E0E"/>
@@ -12819,10 +12798,10 @@
       <w:lang w:eastAsia="es-DO"/>
     </w:rPr>
   </w:style>
-  <w:style w:type="paragraph" w:styleId="Ttulo2">
+  <w:style w:type="paragraph" w:styleId="Heading2">
     <w:name w:val="heading 2"/>
     <w:basedOn w:val="Normal"/>
-    <w:link w:val="Ttulo2Car"/>
+    <w:link w:val="Heading2Char"/>
     <w:uiPriority w:val="9"/>
     <w:qFormat/>
     <w:rsid w:val="008F3E0E"/>
@@ -12839,13 +12818,13 @@
       <w:lang w:eastAsia="es-DO"/>
     </w:rPr>
   </w:style>
-  <w:style w:type="character" w:default="1" w:styleId="Fuentedeprrafopredeter">
+  <w:style w:type="character" w:default="1" w:styleId="DefaultParagraphFont">
     <w:name w:val="Default Paragraph Font"/>
     <w:uiPriority w:val="1"/>
     <w:semiHidden/>
     <w:unhideWhenUsed/>
   </w:style>
-  <w:style w:type="table" w:default="1" w:styleId="Tablanormal">
+  <w:style w:type="table" w:default="1" w:styleId="TableNormal">
     <w:name w:val="Normal Table"/>
     <w:uiPriority w:val="99"/>
     <w:semiHidden/>
@@ -12860,16 +12839,16 @@
       </w:tblCellMar>
     </w:tblPr>
   </w:style>
-  <w:style w:type="numbering" w:default="1" w:styleId="Sinlista">
+  <w:style w:type="numbering" w:default="1" w:styleId="NoList">
     <w:name w:val="No List"/>
     <w:uiPriority w:val="99"/>
     <w:semiHidden/>
     <w:unhideWhenUsed/>
   </w:style>
-  <w:style w:type="character" w:customStyle="1" w:styleId="Ttulo1Car">
-    <w:name w:val="Título 1 Car"/>
-    <w:basedOn w:val="Fuentedeprrafopredeter"/>
-    <w:link w:val="Ttulo1"/>
+  <w:style w:type="character" w:customStyle="1" w:styleId="Heading1Char">
+    <w:name w:val="Heading 1 Char"/>
+    <w:basedOn w:val="DefaultParagraphFont"/>
+    <w:link w:val="Heading1"/>
     <w:uiPriority w:val="9"/>
     <w:rsid w:val="008F3E0E"/>
     <w:rPr>
@@ -12882,10 +12861,10 @@
       <w:lang w:eastAsia="es-DO"/>
     </w:rPr>
   </w:style>
-  <w:style w:type="character" w:customStyle="1" w:styleId="Ttulo2Car">
-    <w:name w:val="Título 2 Car"/>
-    <w:basedOn w:val="Fuentedeprrafopredeter"/>
-    <w:link w:val="Ttulo2"/>
+  <w:style w:type="character" w:customStyle="1" w:styleId="Heading2Char">
+    <w:name w:val="Heading 2 Char"/>
+    <w:basedOn w:val="DefaultParagraphFont"/>
+    <w:link w:val="Heading2"/>
     <w:uiPriority w:val="9"/>
     <w:rsid w:val="008F3E0E"/>
     <w:rPr>
@@ -12899,13 +12878,13 @@
   </w:style>
   <w:style w:type="character" w:customStyle="1" w:styleId="apple-tab-span">
     <w:name w:val="apple-tab-span"/>
-    <w:basedOn w:val="Fuentedeprrafopredeter"/>
+    <w:basedOn w:val="DefaultParagraphFont"/>
     <w:rsid w:val="008F3E0E"/>
   </w:style>
-  <w:style w:type="paragraph" w:styleId="Textodeglobo">
+  <w:style w:type="paragraph" w:styleId="BalloonText">
     <w:name w:val="Balloon Text"/>
     <w:basedOn w:val="Normal"/>
-    <w:link w:val="TextodegloboCar"/>
+    <w:link w:val="BalloonTextChar"/>
     <w:uiPriority w:val="99"/>
     <w:semiHidden/>
     <w:unhideWhenUsed/>
@@ -12919,10 +12898,10 @@
       <w:szCs w:val="16"/>
     </w:rPr>
   </w:style>
-  <w:style w:type="character" w:customStyle="1" w:styleId="TextodegloboCar">
-    <w:name w:val="Texto de globo Car"/>
-    <w:basedOn w:val="Fuentedeprrafopredeter"/>
-    <w:link w:val="Textodeglobo"/>
+  <w:style w:type="character" w:customStyle="1" w:styleId="BalloonTextChar">
+    <w:name w:val="Balloon Text Char"/>
+    <w:basedOn w:val="DefaultParagraphFont"/>
+    <w:link w:val="BalloonText"/>
     <w:uiPriority w:val="99"/>
     <w:semiHidden/>
     <w:rsid w:val="008F3E0E"/>
@@ -12932,9 +12911,9 @@
       <w:szCs w:val="16"/>
     </w:rPr>
   </w:style>
-  <w:style w:type="table" w:styleId="Tablaconcuadrcula">
+  <w:style w:type="table" w:styleId="TableGrid">
     <w:name w:val="Table Grid"/>
-    <w:basedOn w:val="Tablanormal"/>
+    <w:basedOn w:val="TableNormal"/>
     <w:uiPriority w:val="39"/>
     <w:rsid w:val="00090DD1"/>
     <w:pPr>
@@ -12954,9 +12933,9 @@
       </w:tblBorders>
     </w:tblPr>
   </w:style>
-  <w:style w:type="character" w:styleId="Hipervnculo">
+  <w:style w:type="character" w:styleId="Hyperlink">
     <w:name w:val="Hyperlink"/>
-    <w:basedOn w:val="Fuentedeprrafopredeter"/>
+    <w:basedOn w:val="DefaultParagraphFont"/>
     <w:uiPriority w:val="99"/>
     <w:unhideWhenUsed/>
     <w:rsid w:val="00A3556F"/>
@@ -12965,7 +12944,7 @@
       <w:u w:val="single"/>
     </w:rPr>
   </w:style>
-  <w:style w:type="paragraph" w:styleId="TDC1">
+  <w:style w:type="paragraph" w:styleId="TOC1">
     <w:name w:val="toc 1"/>
     <w:basedOn w:val="Normal"/>
     <w:next w:val="Normal"/>
@@ -12983,11 +12962,11 @@
       <w:lang w:val="es-ES"/>
     </w:rPr>
   </w:style>
-  <w:style w:type="paragraph" w:styleId="TDC2">
+  <w:style w:type="paragraph" w:styleId="TOC2">
     <w:name w:val="toc 2"/>
     <w:basedOn w:val="Normal"/>
     <w:next w:val="Normal"/>
-    <w:link w:val="TDC2Car"/>
+    <w:link w:val="TOC2Char"/>
     <w:autoRedefine/>
     <w:uiPriority w:val="39"/>
     <w:unhideWhenUsed/>
@@ -13003,10 +12982,10 @@
       <w:lang w:val="es-ES"/>
     </w:rPr>
   </w:style>
-  <w:style w:type="character" w:customStyle="1" w:styleId="TDC2Car">
-    <w:name w:val="TDC 2 Car"/>
-    <w:basedOn w:val="Fuentedeprrafopredeter"/>
-    <w:link w:val="TDC2"/>
+  <w:style w:type="character" w:customStyle="1" w:styleId="TOC2Char">
+    <w:name w:val="TOC 2 Char"/>
+    <w:basedOn w:val="DefaultParagraphFont"/>
+    <w:link w:val="TOC2"/>
     <w:uiPriority w:val="39"/>
     <w:rsid w:val="00A3556F"/>
     <w:rPr>

</xml_diff>